<commit_message>
estoy revisando el primer parcial
</commit_message>
<xml_diff>
--- a/3_paciales/1_parcial/Parcial1_Programacion_Python_v1.docx
+++ b/3_paciales/1_parcial/Parcial1_Programacion_Python_v1.docx
@@ -235,113 +235,13 @@
           <w:sz w:val="22"/>
           <w:szCs w:val="22"/>
         </w:rPr>
-        <w:t>Documento de Identidad</w:t>
-      </w:r>
-      <w:r>
-        <w:rPr>
-          <w:rFonts w:ascii="Calibri" w:eastAsia="Calibri" w:hAnsi="Calibri" w:cs="Calibri"/>
-          <w:sz w:val="22"/>
-          <w:szCs w:val="22"/>
-        </w:rPr>
-        <w:t>: ______________</w:t>
-      </w:r>
-      <w:r>
-        <w:rPr>
-          <w:rFonts w:ascii="Calibri" w:eastAsia="Calibri" w:hAnsi="Calibri" w:cs="Calibri"/>
-          <w:sz w:val="22"/>
-          <w:szCs w:val="22"/>
-        </w:rPr>
-        <w:t>__________</w:t>
-      </w:r>
-    </w:p>
-    <w:p>
-      <w:pPr>
-        <w:pStyle w:val="Ttulo1"/>
-        <w:spacing w:before="300" w:after="150"/>
-      </w:pPr>
-      <w:r>
-        <w:t>Nota de diseño (para el docente)</w:t>
+        <w:t>Documento de Identidad: ________________________</w:t>
       </w:r>
     </w:p>
     <w:p>
       <w:pPr>
         <w:spacing w:after="120"/>
       </w:pPr>
-      <w:r>
-        <w:rPr>
-          <w:rFonts w:ascii="Calibri" w:eastAsia="Calibri" w:hAnsi="Calibri" w:cs="Calibri"/>
-          <w:sz w:val="22"/>
-          <w:szCs w:val="22"/>
-        </w:rPr>
-        <w:t>Este documento contiene (1) el diseño/</w:t>
-      </w:r>
-      <w:proofErr w:type="spellStart"/>
-      <w:r>
-        <w:rPr>
-          <w:rFonts w:ascii="Calibri" w:eastAsia="Calibri" w:hAnsi="Calibri" w:cs="Calibri"/>
-          <w:sz w:val="22"/>
-          <w:szCs w:val="22"/>
-        </w:rPr>
-        <w:t>blueprint</w:t>
-      </w:r>
-      <w:proofErr w:type="spellEnd"/>
-      <w:r>
-        <w:rPr>
-          <w:rFonts w:ascii="Calibri" w:eastAsia="Calibri" w:hAnsi="Calibri" w:cs="Calibri"/>
-          <w:sz w:val="22"/>
-          <w:szCs w:val="22"/>
-        </w:rPr>
-        <w:t xml:space="preserve"> del parcial —justificación, distribución de puntos y tiempos— y (2) el instrumento completo listo para aplicar. El diseño cubre exactamente los temas desarrollados en los cuadernos del curso: Capítulo 1 (naturaleza y paradigmas de Python, REPL), Capítulo 3 secciones 1 a 8 (tipos de datos, variables, estructuras incorporadas mutables e inmutables, operadores aritméticos, relacionales, de asignación, lógicos, de pertenencia y de identidad).</w:t>
-      </w:r>
-    </w:p>
-    <w:p>
-      <w:pPr>
-        <w:spacing w:after="120"/>
-      </w:pPr>
-      <w:r>
-        <w:rPr>
-          <w:rFonts w:ascii="Calibri" w:eastAsia="Calibri" w:hAnsi="Calibri" w:cs="Calibri"/>
-          <w:sz w:val="22"/>
-          <w:szCs w:val="22"/>
-        </w:rPr>
-        <w:t xml:space="preserve">Criterio de diseño: para 2 horas con estudiantes de matemáticas puras (que ya manejan álgebra y lógica proposicional, pero están en su primer contacto profundo con Python), el número óptimo de preguntas principales es 12, distribuidas en 6 partes temáticas, con sub-ítems que permiten discriminar comprensión conceptual (predicción de resultados, sin ejecutar) de habilidad de codificación (escribir código). Esto evita tanto la sobrecarga cognitiva de un parcial con 30+ </w:t>
-      </w:r>
-      <w:proofErr w:type="spellStart"/>
-      <w:r>
-        <w:rPr>
-          <w:rFonts w:ascii="Calibri" w:eastAsia="Calibri" w:hAnsi="Calibri" w:cs="Calibri"/>
-          <w:sz w:val="22"/>
-          <w:szCs w:val="22"/>
-        </w:rPr>
-        <w:t>micro-preguntas</w:t>
-      </w:r>
-      <w:proofErr w:type="spellEnd"/>
-      <w:r>
-        <w:rPr>
-          <w:rFonts w:ascii="Calibri" w:eastAsia="Calibri" w:hAnsi="Calibri" w:cs="Calibri"/>
-          <w:sz w:val="22"/>
-          <w:szCs w:val="22"/>
-        </w:rPr>
-        <w:t xml:space="preserve"> como la </w:t>
-      </w:r>
-      <w:proofErr w:type="spellStart"/>
-      <w:r>
-        <w:rPr>
-          <w:rFonts w:ascii="Calibri" w:eastAsia="Calibri" w:hAnsi="Calibri" w:cs="Calibri"/>
-          <w:sz w:val="22"/>
-          <w:szCs w:val="22"/>
-        </w:rPr>
-        <w:t>subevaluación</w:t>
-      </w:r>
-      <w:proofErr w:type="spellEnd"/>
-      <w:r>
-        <w:rPr>
-          <w:rFonts w:ascii="Calibri" w:eastAsia="Calibri" w:hAnsi="Calibri" w:cs="Calibri"/>
-          <w:sz w:val="22"/>
-          <w:szCs w:val="22"/>
-        </w:rPr>
-        <w:t xml:space="preserve"> de un parcial con muy pocos problemas de alto peso.</w:t>
-      </w:r>
     </w:p>
     <w:p>
       <w:pPr>
@@ -377,12 +277,6 @@
         <w:gridCol w:w="1900"/>
       </w:tblGrid>
       <w:tr>
-        <w:tblPrEx>
-          <w:tblCellMar>
-            <w:top w:w="0" w:type="dxa"/>
-            <w:bottom w:w="0" w:type="dxa"/>
-          </w:tblCellMar>
-        </w:tblPrEx>
         <w:trPr>
           <w:tblHeader/>
         </w:trPr>
@@ -473,12 +367,6 @@
         </w:tc>
       </w:tr>
       <w:tr>
-        <w:tblPrEx>
-          <w:tblCellMar>
-            <w:top w:w="0" w:type="dxa"/>
-            <w:bottom w:w="0" w:type="dxa"/>
-          </w:tblCellMar>
-        </w:tblPrEx>
         <w:tc>
           <w:tcPr>
             <w:tcW w:w="1300" w:type="dxa"/>
@@ -546,12 +434,6 @@
         </w:tc>
       </w:tr>
       <w:tr>
-        <w:tblPrEx>
-          <w:tblCellMar>
-            <w:top w:w="0" w:type="dxa"/>
-            <w:bottom w:w="0" w:type="dxa"/>
-          </w:tblCellMar>
-        </w:tblPrEx>
         <w:tc>
           <w:tcPr>
             <w:tcW w:w="1300" w:type="dxa"/>
@@ -619,12 +501,6 @@
         </w:tc>
       </w:tr>
       <w:tr>
-        <w:tblPrEx>
-          <w:tblCellMar>
-            <w:top w:w="0" w:type="dxa"/>
-            <w:bottom w:w="0" w:type="dxa"/>
-          </w:tblCellMar>
-        </w:tblPrEx>
         <w:tc>
           <w:tcPr>
             <w:tcW w:w="1300" w:type="dxa"/>
@@ -692,12 +568,6 @@
         </w:tc>
       </w:tr>
       <w:tr>
-        <w:tblPrEx>
-          <w:tblCellMar>
-            <w:top w:w="0" w:type="dxa"/>
-            <w:bottom w:w="0" w:type="dxa"/>
-          </w:tblCellMar>
-        </w:tblPrEx>
         <w:tc>
           <w:tcPr>
             <w:tcW w:w="1300" w:type="dxa"/>
@@ -793,12 +663,6 @@
         </w:tc>
       </w:tr>
       <w:tr>
-        <w:tblPrEx>
-          <w:tblCellMar>
-            <w:top w:w="0" w:type="dxa"/>
-            <w:bottom w:w="0" w:type="dxa"/>
-          </w:tblCellMar>
-        </w:tblPrEx>
         <w:tc>
           <w:tcPr>
             <w:tcW w:w="1300" w:type="dxa"/>
@@ -880,12 +744,6 @@
         </w:tc>
       </w:tr>
       <w:tr>
-        <w:tblPrEx>
-          <w:tblCellMar>
-            <w:top w:w="0" w:type="dxa"/>
-            <w:bottom w:w="0" w:type="dxa"/>
-          </w:tblCellMar>
-        </w:tblPrEx>
         <w:tc>
           <w:tcPr>
             <w:tcW w:w="1300" w:type="dxa"/>
@@ -953,12 +811,6 @@
         </w:tc>
       </w:tr>
       <w:tr>
-        <w:tblPrEx>
-          <w:tblCellMar>
-            <w:top w:w="0" w:type="dxa"/>
-            <w:bottom w:w="0" w:type="dxa"/>
-          </w:tblCellMar>
-        </w:tblPrEx>
         <w:tc>
           <w:tcPr>
             <w:tcW w:w="1300" w:type="dxa"/>
@@ -1194,7 +1046,6 @@
           <w:sz w:val="22"/>
           <w:szCs w:val="22"/>
         </w:rPr>
-        <w:lastRenderedPageBreak/>
         <w:t>Diferenciar estructuras mutables (</w:t>
       </w:r>
       <w:proofErr w:type="spellStart"/>
@@ -1267,43 +1118,25 @@
           <w:sz w:val="22"/>
           <w:szCs w:val="22"/>
         </w:rPr>
-        <w:t xml:space="preserve">, </w:t>
-      </w:r>
-      <w:proofErr w:type="spellStart"/>
-      <w:r>
-        <w:rPr>
-          <w:rFonts w:ascii="Calibri" w:eastAsia="Calibri" w:hAnsi="Calibri" w:cs="Calibri"/>
-          <w:sz w:val="22"/>
-          <w:szCs w:val="22"/>
-        </w:rPr>
-        <w:t>frozenset</w:t>
-      </w:r>
-      <w:proofErr w:type="spellEnd"/>
-      <w:r>
-        <w:rPr>
-          <w:rFonts w:ascii="Calibri" w:eastAsia="Calibri" w:hAnsi="Calibri" w:cs="Calibri"/>
-          <w:sz w:val="22"/>
-          <w:szCs w:val="22"/>
-        </w:rPr>
-        <w:t xml:space="preserve">) y sus implicaciones (id(), </w:t>
-      </w:r>
-      <w:proofErr w:type="spellStart"/>
-      <w:r>
-        <w:rPr>
-          <w:rFonts w:ascii="Calibri" w:eastAsia="Calibri" w:hAnsi="Calibri" w:cs="Calibri"/>
-          <w:sz w:val="22"/>
-          <w:szCs w:val="22"/>
-        </w:rPr>
-        <w:t>aliasing</w:t>
-      </w:r>
-      <w:proofErr w:type="spellEnd"/>
-      <w:r>
-        <w:rPr>
-          <w:rFonts w:ascii="Calibri" w:eastAsia="Calibri" w:hAnsi="Calibri" w:cs="Calibri"/>
-          <w:sz w:val="22"/>
-          <w:szCs w:val="22"/>
-        </w:rPr>
-        <w:t>, argumentos por defecto).</w:t>
+        <w:t>) y sus implicaciones (</w:t>
+      </w:r>
+      <w:proofErr w:type="gramStart"/>
+      <w:r>
+        <w:rPr>
+          <w:rFonts w:ascii="Calibri" w:eastAsia="Calibri" w:hAnsi="Calibri" w:cs="Calibri"/>
+          <w:sz w:val="22"/>
+          <w:szCs w:val="22"/>
+        </w:rPr>
+        <w:t>id(</w:t>
+      </w:r>
+      <w:proofErr w:type="gramEnd"/>
+      <w:r>
+        <w:rPr>
+          <w:rFonts w:ascii="Calibri" w:eastAsia="Calibri" w:hAnsi="Calibri" w:cs="Calibri"/>
+          <w:sz w:val="22"/>
+          <w:szCs w:val="22"/>
+        </w:rPr>
+        <w:t>), argumentos por defecto).</w:t>
       </w:r>
     </w:p>
     <w:p>
@@ -1533,7 +1366,41 @@
           <w:sz w:val="22"/>
           <w:szCs w:val="22"/>
         </w:rPr>
-        <w:t xml:space="preserve"> llamado parcial1_apellido_nombre.ipynb, según indique su profesor.</w:t>
+        <w:t xml:space="preserve"> llamado parcial1_apellido_</w:t>
+      </w:r>
+      <w:proofErr w:type="gramStart"/>
+      <w:r>
+        <w:rPr>
+          <w:rFonts w:ascii="Calibri" w:eastAsia="Calibri" w:hAnsi="Calibri" w:cs="Calibri"/>
+          <w:sz w:val="22"/>
+          <w:szCs w:val="22"/>
+        </w:rPr>
+        <w:t>nombre.ipynb</w:t>
+      </w:r>
+      <w:proofErr w:type="gramEnd"/>
+      <w:r>
+        <w:rPr>
+          <w:rFonts w:ascii="Calibri" w:eastAsia="Calibri" w:hAnsi="Calibri" w:cs="Calibri"/>
+          <w:sz w:val="22"/>
+          <w:szCs w:val="22"/>
+        </w:rPr>
+        <w:t xml:space="preserve">, </w:t>
+      </w:r>
+      <w:r>
+        <w:rPr>
+          <w:rFonts w:ascii="Calibri" w:eastAsia="Calibri" w:hAnsi="Calibri" w:cs="Calibri"/>
+          <w:sz w:val="22"/>
+          <w:szCs w:val="22"/>
+        </w:rPr>
+        <w:t>o de manera manual en el reverso de las hojas entregadas</w:t>
+      </w:r>
+      <w:r>
+        <w:rPr>
+          <w:rFonts w:ascii="Calibri" w:eastAsia="Calibri" w:hAnsi="Calibri" w:cs="Calibri"/>
+          <w:sz w:val="22"/>
+          <w:szCs w:val="22"/>
+        </w:rPr>
+        <w:t>.</w:t>
       </w:r>
     </w:p>
     <w:p>
@@ -1551,7 +1418,7 @@
           <w:sz w:val="22"/>
           <w:szCs w:val="22"/>
         </w:rPr>
-        <w:t>En las preguntas marcadas “(predicción)”, escriba primero el resultado esperado SIN ejecutar Python; luego, si tiene computador, verifique.</w:t>
+        <w:t>En las preguntas marcadas “(predicción)”, escriba primero el resultado esperado SIN ejecutar Python; luego.</w:t>
       </w:r>
     </w:p>
     <w:p>
@@ -1587,7 +1454,23 @@
           <w:sz w:val="22"/>
           <w:szCs w:val="22"/>
         </w:rPr>
-        <w:t>El uso de asistentes de IA o de fuentes externas no autorizadas anula el parcial.</w:t>
+        <w:t>El uso de asistentes de IA</w:t>
+      </w:r>
+      <w:r>
+        <w:rPr>
+          <w:rFonts w:ascii="Calibri" w:eastAsia="Calibri" w:hAnsi="Calibri" w:cs="Calibri"/>
+          <w:sz w:val="22"/>
+          <w:szCs w:val="22"/>
+        </w:rPr>
+        <w:t>, o celulares</w:t>
+      </w:r>
+      <w:r>
+        <w:rPr>
+          <w:rFonts w:ascii="Calibri" w:eastAsia="Calibri" w:hAnsi="Calibri" w:cs="Calibri"/>
+          <w:sz w:val="22"/>
+          <w:szCs w:val="22"/>
+        </w:rPr>
+        <w:t xml:space="preserve"> o de fuentes externas no autorizadas anula el parcial.</w:t>
       </w:r>
     </w:p>
     <w:p>
@@ -1603,8 +1486,107 @@
         <w:pStyle w:val="Ttulo1"/>
         <w:spacing w:before="300" w:after="150"/>
       </w:pPr>
-      <w:r>
-        <w:t>Parte I — Tipos de datos, variables y mutabilidad  (18 puntos)</w:t>
+    </w:p>
+    <w:p>
+      <w:pPr>
+        <w:pStyle w:val="Ttulo1"/>
+        <w:spacing w:before="300" w:after="150"/>
+      </w:pPr>
+    </w:p>
+    <w:p>
+      <w:pPr>
+        <w:pStyle w:val="Ttulo1"/>
+        <w:spacing w:before="300" w:after="150"/>
+      </w:pPr>
+    </w:p>
+    <w:p>
+      <w:pPr>
+        <w:pStyle w:val="Ttulo1"/>
+        <w:spacing w:before="300" w:after="150"/>
+      </w:pPr>
+    </w:p>
+    <w:p>
+      <w:pPr>
+        <w:pStyle w:val="Ttulo1"/>
+        <w:spacing w:before="300" w:after="150"/>
+      </w:pPr>
+    </w:p>
+    <w:p>
+      <w:pPr>
+        <w:pStyle w:val="Ttulo1"/>
+        <w:spacing w:before="300" w:after="150"/>
+      </w:pPr>
+    </w:p>
+    <w:p>
+      <w:pPr>
+        <w:pStyle w:val="Ttulo1"/>
+        <w:spacing w:before="300" w:after="150"/>
+      </w:pPr>
+    </w:p>
+    <w:p>
+      <w:pPr>
+        <w:pStyle w:val="Ttulo1"/>
+        <w:spacing w:before="300" w:after="150"/>
+      </w:pPr>
+    </w:p>
+    <w:p>
+      <w:pPr>
+        <w:pStyle w:val="Ttulo1"/>
+        <w:spacing w:before="300" w:after="150"/>
+      </w:pPr>
+    </w:p>
+    <w:p>
+      <w:pPr>
+        <w:pStyle w:val="Ttulo1"/>
+        <w:spacing w:before="300" w:after="150"/>
+      </w:pPr>
+    </w:p>
+    <w:p>
+      <w:pPr>
+        <w:pStyle w:val="Ttulo1"/>
+        <w:spacing w:before="300" w:after="150"/>
+      </w:pPr>
+    </w:p>
+    <w:p>
+      <w:pPr>
+        <w:pStyle w:val="Ttulo1"/>
+        <w:spacing w:before="300" w:after="150"/>
+      </w:pPr>
+    </w:p>
+    <w:p>
+      <w:pPr>
+        <w:pStyle w:val="Ttulo1"/>
+        <w:spacing w:before="300" w:after="150"/>
+      </w:pPr>
+    </w:p>
+    <w:p>
+      <w:pPr>
+        <w:pStyle w:val="Ttulo1"/>
+        <w:spacing w:before="300" w:after="150"/>
+      </w:pPr>
+    </w:p>
+    <w:p>
+      <w:pPr>
+        <w:pStyle w:val="Ttulo1"/>
+        <w:spacing w:before="300" w:after="150"/>
+      </w:pPr>
+    </w:p>
+    <w:p>
+      <w:pPr>
+        <w:pStyle w:val="Ttulo1"/>
+        <w:spacing w:before="300" w:after="150"/>
+      </w:pPr>
+      <w:r>
+        <w:lastRenderedPageBreak/>
+        <w:t xml:space="preserve">Parte I — Tipos de datos, variables y </w:t>
+      </w:r>
+      <w:proofErr w:type="gramStart"/>
+      <w:r>
+        <w:t>mutabilidad  (</w:t>
+      </w:r>
+      <w:proofErr w:type="gramEnd"/>
+      <w:r>
+        <w:t>18 puntos)</w:t>
       </w:r>
     </w:p>
     <w:p>
@@ -1841,6 +1823,7 @@
         <w:br/>
       </w:r>
       <w:proofErr w:type="spellStart"/>
+      <w:proofErr w:type="gramStart"/>
       <w:r>
         <w:rPr>
           <w:rFonts w:ascii="Consolas" w:eastAsia="Consolas" w:hAnsi="Consolas" w:cs="Consolas"/>
@@ -1848,6 +1831,7 @@
         <w:t>lista.append</w:t>
       </w:r>
       <w:proofErr w:type="spellEnd"/>
+      <w:proofErr w:type="gramEnd"/>
       <w:r>
         <w:rPr>
           <w:rFonts w:ascii="Consolas" w:eastAsia="Consolas" w:hAnsi="Consolas" w:cs="Consolas"/>
@@ -1997,7 +1981,73 @@
           <w:sz w:val="22"/>
           <w:szCs w:val="22"/>
         </w:rPr>
-        <w:t>3. (6 puntos) Sea el conjunto matemático  A = { x² | x ∈ ℕ, x &lt; 8, x par }.</w:t>
+        <w:t xml:space="preserve">3. (6 puntos) Sea el conjunto </w:t>
+      </w:r>
+      <w:proofErr w:type="gramStart"/>
+      <w:r>
+        <w:rPr>
+          <w:rFonts w:ascii="Calibri" w:eastAsia="Calibri" w:hAnsi="Calibri" w:cs="Calibri"/>
+          <w:b/>
+          <w:bCs/>
+          <w:sz w:val="22"/>
+          <w:szCs w:val="22"/>
+        </w:rPr>
+        <w:t>matemático  A</w:t>
+      </w:r>
+      <w:proofErr w:type="gramEnd"/>
+      <w:r>
+        <w:rPr>
+          <w:rFonts w:ascii="Calibri" w:eastAsia="Calibri" w:hAnsi="Calibri" w:cs="Calibri"/>
+          <w:b/>
+          <w:bCs/>
+          <w:sz w:val="22"/>
+          <w:szCs w:val="22"/>
+        </w:rPr>
+        <w:t xml:space="preserve"> = </w:t>
+      </w:r>
+      <w:proofErr w:type="gramStart"/>
+      <w:r>
+        <w:rPr>
+          <w:rFonts w:ascii="Calibri" w:eastAsia="Calibri" w:hAnsi="Calibri" w:cs="Calibri"/>
+          <w:b/>
+          <w:bCs/>
+          <w:sz w:val="22"/>
+          <w:szCs w:val="22"/>
+        </w:rPr>
+        <w:t>{ x</w:t>
+      </w:r>
+      <w:proofErr w:type="gramEnd"/>
+      <w:r>
+        <w:rPr>
+          <w:rFonts w:ascii="Calibri" w:eastAsia="Calibri" w:hAnsi="Calibri" w:cs="Calibri"/>
+          <w:b/>
+          <w:bCs/>
+          <w:sz w:val="22"/>
+          <w:szCs w:val="22"/>
+        </w:rPr>
+        <w:t xml:space="preserve">² | x ∈ ℕ, x &lt; 8, x </w:t>
+      </w:r>
+      <w:proofErr w:type="gramStart"/>
+      <w:r>
+        <w:rPr>
+          <w:rFonts w:ascii="Calibri" w:eastAsia="Calibri" w:hAnsi="Calibri" w:cs="Calibri"/>
+          <w:b/>
+          <w:bCs/>
+          <w:sz w:val="22"/>
+          <w:szCs w:val="22"/>
+        </w:rPr>
+        <w:t>par }</w:t>
+      </w:r>
+      <w:proofErr w:type="gramEnd"/>
+      <w:r>
+        <w:rPr>
+          <w:rFonts w:ascii="Calibri" w:eastAsia="Calibri" w:hAnsi="Calibri" w:cs="Calibri"/>
+          <w:b/>
+          <w:bCs/>
+          <w:sz w:val="22"/>
+          <w:szCs w:val="22"/>
+        </w:rPr>
+        <w:t>.</w:t>
       </w:r>
     </w:p>
     <w:p>
@@ -2089,8 +2139,15 @@
         <w:spacing w:before="300" w:after="150"/>
       </w:pPr>
       <w:r>
-        <w:lastRenderedPageBreak/>
-        <w:t>Parte II — Operadores aritméticos y precedencia  (15 puntos)</w:t>
+        <w:t xml:space="preserve">Parte II — Operadores aritméticos y </w:t>
+      </w:r>
+      <w:proofErr w:type="gramStart"/>
+      <w:r>
+        <w:t>precedencia  (</w:t>
+      </w:r>
+      <w:proofErr w:type="gramEnd"/>
+      <w:r>
+        <w:t>15 puntos)</w:t>
       </w:r>
     </w:p>
     <w:p>
@@ -2123,11 +2180,19 @@
       <w:r>
         <w:br/>
       </w:r>
-      <w:r>
-        <w:rPr>
-          <w:rFonts w:ascii="Consolas" w:eastAsia="Consolas" w:hAnsi="Consolas" w:cs="Consolas"/>
-        </w:rPr>
-        <w:t>b)  (2 + 3) * 4 ** 2</w:t>
+      <w:proofErr w:type="gramStart"/>
+      <w:r>
+        <w:rPr>
+          <w:rFonts w:ascii="Consolas" w:eastAsia="Consolas" w:hAnsi="Consolas" w:cs="Consolas"/>
+        </w:rPr>
+        <w:t>b)  (</w:t>
+      </w:r>
+      <w:proofErr w:type="gramEnd"/>
+      <w:r>
+        <w:rPr>
+          <w:rFonts w:ascii="Consolas" w:eastAsia="Consolas" w:hAnsi="Consolas" w:cs="Consolas"/>
+        </w:rPr>
+        <w:t>2 + 3) * 4 ** 2</w:t>
       </w:r>
       <w:r>
         <w:br/>
@@ -2136,7 +2201,21 @@
         <w:rPr>
           <w:rFonts w:ascii="Consolas" w:eastAsia="Consolas" w:hAnsi="Consolas" w:cs="Consolas"/>
         </w:rPr>
-        <w:t>c)  2 ** 3 ** 2</w:t>
+        <w:t>c</w:t>
+      </w:r>
+      <w:proofErr w:type="gramStart"/>
+      <w:r>
+        <w:rPr>
+          <w:rFonts w:ascii="Consolas" w:eastAsia="Consolas" w:hAnsi="Consolas" w:cs="Consolas"/>
+        </w:rPr>
+        <w:t>)  2</w:t>
+      </w:r>
+      <w:proofErr w:type="gramEnd"/>
+      <w:r>
+        <w:rPr>
+          <w:rFonts w:ascii="Consolas" w:eastAsia="Consolas" w:hAnsi="Consolas" w:cs="Consolas"/>
+        </w:rPr>
+        <w:t xml:space="preserve"> ** 3 ** 2</w:t>
       </w:r>
       <w:r>
         <w:br/>
@@ -2145,34 +2224,72 @@
         <w:rPr>
           <w:rFonts w:ascii="Consolas" w:eastAsia="Consolas" w:hAnsi="Consolas" w:cs="Consolas"/>
         </w:rPr>
-        <w:t>d)  -3 ** 2</w:t>
+        <w:t>d</w:t>
+      </w:r>
+      <w:proofErr w:type="gramStart"/>
+      <w:r>
+        <w:rPr>
+          <w:rFonts w:ascii="Consolas" w:eastAsia="Consolas" w:hAnsi="Consolas" w:cs="Consolas"/>
+        </w:rPr>
+        <w:t>)  -</w:t>
+      </w:r>
+      <w:proofErr w:type="gramEnd"/>
+      <w:r>
+        <w:rPr>
+          <w:rFonts w:ascii="Consolas" w:eastAsia="Consolas" w:hAnsi="Consolas" w:cs="Consolas"/>
+        </w:rPr>
+        <w:t>3 ** 2</w:t>
       </w:r>
       <w:r>
         <w:br/>
       </w:r>
-      <w:r>
-        <w:rPr>
-          <w:rFonts w:ascii="Consolas" w:eastAsia="Consolas" w:hAnsi="Consolas" w:cs="Consolas"/>
-        </w:rPr>
-        <w:t>e)  (-3) ** 2</w:t>
+      <w:proofErr w:type="gramStart"/>
+      <w:r>
+        <w:rPr>
+          <w:rFonts w:ascii="Consolas" w:eastAsia="Consolas" w:hAnsi="Consolas" w:cs="Consolas"/>
+        </w:rPr>
+        <w:t>e)  (</w:t>
+      </w:r>
+      <w:proofErr w:type="gramEnd"/>
+      <w:r>
+        <w:rPr>
+          <w:rFonts w:ascii="Consolas" w:eastAsia="Consolas" w:hAnsi="Consolas" w:cs="Consolas"/>
+        </w:rPr>
+        <w:t>-3) ** 2</w:t>
       </w:r>
       <w:r>
         <w:br/>
       </w:r>
-      <w:r>
-        <w:rPr>
-          <w:rFonts w:ascii="Consolas" w:eastAsia="Consolas" w:hAnsi="Consolas" w:cs="Consolas"/>
-        </w:rPr>
-        <w:t>f)  17 // 5 + 17 % 5</w:t>
+      <w:proofErr w:type="gramStart"/>
+      <w:r>
+        <w:rPr>
+          <w:rFonts w:ascii="Consolas" w:eastAsia="Consolas" w:hAnsi="Consolas" w:cs="Consolas"/>
+        </w:rPr>
+        <w:t>f)  17</w:t>
+      </w:r>
+      <w:proofErr w:type="gramEnd"/>
+      <w:r>
+        <w:rPr>
+          <w:rFonts w:ascii="Consolas" w:eastAsia="Consolas" w:hAnsi="Consolas" w:cs="Consolas"/>
+        </w:rPr>
+        <w:t xml:space="preserve"> // 5 + 17 % 5</w:t>
       </w:r>
       <w:r>
         <w:br/>
       </w:r>
-      <w:r>
-        <w:rPr>
-          <w:rFonts w:ascii="Consolas" w:eastAsia="Consolas" w:hAnsi="Consolas" w:cs="Consolas"/>
-        </w:rPr>
-        <w:t>g)  2 * 3 / 2 // 2 % 2</w:t>
+      <w:proofErr w:type="gramStart"/>
+      <w:r>
+        <w:rPr>
+          <w:rFonts w:ascii="Consolas" w:eastAsia="Consolas" w:hAnsi="Consolas" w:cs="Consolas"/>
+        </w:rPr>
+        <w:t>g)  2</w:t>
+      </w:r>
+      <w:proofErr w:type="gramEnd"/>
+      <w:r>
+        <w:rPr>
+          <w:rFonts w:ascii="Consolas" w:eastAsia="Consolas" w:hAnsi="Consolas" w:cs="Consolas"/>
+        </w:rPr>
+        <w:t xml:space="preserve"> * 3 / 2 // 2 % 2</w:t>
       </w:r>
     </w:p>
     <w:p>
@@ -2213,6 +2330,7 @@
           <w:sz w:val="22"/>
           <w:szCs w:val="22"/>
         </w:rPr>
+        <w:lastRenderedPageBreak/>
         <w:t xml:space="preserve">b) Explique por qué c debe declararse necesariamente como </w:t>
       </w:r>
       <w:proofErr w:type="spellStart"/>
@@ -2351,8 +2469,15 @@
         <w:spacing w:before="300" w:after="150"/>
       </w:pPr>
       <w:r>
-        <w:lastRenderedPageBreak/>
-        <w:t>Parte III — Operadores relacionales y de asignación  (14 puntos)</w:t>
+        <w:t xml:space="preserve">Parte III — Operadores relacionales y de </w:t>
+      </w:r>
+      <w:proofErr w:type="gramStart"/>
+      <w:r>
+        <w:t>asignación  (</w:t>
+      </w:r>
+      <w:proofErr w:type="gramEnd"/>
+      <w:r>
+        <w:t>14 puntos)</w:t>
       </w:r>
     </w:p>
     <w:p>
@@ -2380,7 +2505,21 @@
         <w:rPr>
           <w:rFonts w:ascii="Consolas" w:eastAsia="Consolas" w:hAnsi="Consolas" w:cs="Consolas"/>
         </w:rPr>
-        <w:t xml:space="preserve">x &gt; y      x == y      x != y      x &lt;= y      x &gt;= 12      x &lt; y </w:t>
+        <w:t xml:space="preserve">x &gt; y      x == y      </w:t>
+      </w:r>
+      <w:proofErr w:type="gramStart"/>
+      <w:r>
+        <w:rPr>
+          <w:rFonts w:ascii="Consolas" w:eastAsia="Consolas" w:hAnsi="Consolas" w:cs="Consolas"/>
+        </w:rPr>
+        <w:t>x !</w:t>
+      </w:r>
+      <w:proofErr w:type="gramEnd"/>
+      <w:r>
+        <w:rPr>
+          <w:rFonts w:ascii="Consolas" w:eastAsia="Consolas" w:hAnsi="Consolas" w:cs="Consolas"/>
+        </w:rPr>
+        <w:t xml:space="preserve">= y      x &lt;= y      x &gt;= 12      x &lt; y </w:t>
       </w:r>
       <w:proofErr w:type="spellStart"/>
       <w:r>
@@ -2492,6 +2631,7 @@
           <w:sz w:val="22"/>
           <w:szCs w:val="22"/>
         </w:rPr>
+        <w:lastRenderedPageBreak/>
         <w:t xml:space="preserve">c) Explique, en una frase, por qué se dice que los operadores </w:t>
       </w:r>
       <w:proofErr w:type="spellStart"/>
@@ -2533,7 +2673,15 @@
       </w:pPr>
       <w:r>
         <w:lastRenderedPageBreak/>
-        <w:t>Parte IV — Operadores lógicos  (13 puntos)</w:t>
+        <w:t xml:space="preserve">Parte IV — Operadores </w:t>
+      </w:r>
+      <w:proofErr w:type="gramStart"/>
+      <w:r>
+        <w:t>lógicos  (</w:t>
+      </w:r>
+      <w:proofErr w:type="gramEnd"/>
+      <w:r>
+        <w:t>13 puntos)</w:t>
       </w:r>
     </w:p>
     <w:p>
@@ -2881,7 +3029,15 @@
       </w:pPr>
       <w:r>
         <w:lastRenderedPageBreak/>
-        <w:t>Parte V — Operadores de pertenencia e identidad  (12 puntos)</w:t>
+        <w:t xml:space="preserve">Parte V — Operadores de pertenencia e </w:t>
+      </w:r>
+      <w:proofErr w:type="gramStart"/>
+      <w:r>
+        <w:t>identidad  (</w:t>
+      </w:r>
+      <w:proofErr w:type="gramEnd"/>
+      <w:r>
+        <w:t>12 puntos)</w:t>
       </w:r>
     </w:p>
     <w:p>
@@ -3089,7 +3245,16 @@
           <w:sz w:val="22"/>
           <w:szCs w:val="22"/>
         </w:rPr>
-        <w:t>c) ¿Qué relación de identidad tienen lista1 y lista3? Explique por qué modificar lista3 con .</w:t>
+        <w:t xml:space="preserve">c) ¿Qué relación de identidad tienen lista1 y lista3? Explique por qué modificar lista3 </w:t>
+      </w:r>
+      <w:proofErr w:type="gramStart"/>
+      <w:r>
+        <w:rPr>
+          <w:rFonts w:ascii="Calibri" w:eastAsia="Calibri" w:hAnsi="Calibri" w:cs="Calibri"/>
+          <w:sz w:val="22"/>
+          <w:szCs w:val="22"/>
+        </w:rPr>
+        <w:t>con .</w:t>
       </w:r>
       <w:proofErr w:type="spellStart"/>
       <w:r>
@@ -3101,6 +3266,7 @@
         <w:t>append</w:t>
       </w:r>
       <w:proofErr w:type="spellEnd"/>
+      <w:proofErr w:type="gramEnd"/>
       <w:r>
         <w:rPr>
           <w:rFonts w:ascii="Calibri" w:eastAsia="Calibri" w:hAnsi="Calibri" w:cs="Calibri"/>
@@ -3197,7 +3363,15 @@
       </w:pPr>
       <w:r>
         <w:lastRenderedPageBreak/>
-        <w:t>Parte VI — Problema integrador  (18 puntos)</w:t>
+        <w:t xml:space="preserve">Parte VI — Problema </w:t>
+      </w:r>
+      <w:proofErr w:type="gramStart"/>
+      <w:r>
+        <w:t>integrador  (</w:t>
+      </w:r>
+      <w:proofErr w:type="gramEnd"/>
+      <w:r>
+        <w:t>18 puntos)</w:t>
       </w:r>
     </w:p>
     <w:p>
@@ -3428,9 +3602,28 @@
           <w:sz w:val="22"/>
           <w:szCs w:val="22"/>
         </w:rPr>
-        <w:t xml:space="preserve">) Calcule, con la lista filtrada, el promedio, el máximo y el mínimo usando sum(), </w:t>
-      </w:r>
-      <w:proofErr w:type="spellStart"/>
+        <w:t xml:space="preserve">) Calcule, con la lista filtrada, el promedio, el máximo y el mínimo usando </w:t>
+      </w:r>
+      <w:proofErr w:type="gramStart"/>
+      <w:r>
+        <w:rPr>
+          <w:rFonts w:ascii="Calibri" w:eastAsia="Calibri" w:hAnsi="Calibri" w:cs="Calibri"/>
+          <w:sz w:val="22"/>
+          <w:szCs w:val="22"/>
+        </w:rPr>
+        <w:t>sum(</w:t>
+      </w:r>
+      <w:proofErr w:type="gramEnd"/>
+      <w:r>
+        <w:rPr>
+          <w:rFonts w:ascii="Calibri" w:eastAsia="Calibri" w:hAnsi="Calibri" w:cs="Calibri"/>
+          <w:sz w:val="22"/>
+          <w:szCs w:val="22"/>
+        </w:rPr>
+        <w:t xml:space="preserve">), </w:t>
+      </w:r>
+      <w:proofErr w:type="spellStart"/>
+      <w:proofErr w:type="gramStart"/>
       <w:r>
         <w:rPr>
           <w:rFonts w:ascii="Calibri" w:eastAsia="Calibri" w:hAnsi="Calibri" w:cs="Calibri"/>
@@ -3446,9 +3639,19 @@
           <w:sz w:val="22"/>
           <w:szCs w:val="22"/>
         </w:rPr>
-        <w:t xml:space="preserve">(), </w:t>
-      </w:r>
-      <w:proofErr w:type="spellStart"/>
+        <w:t>(</w:t>
+      </w:r>
+      <w:proofErr w:type="gramEnd"/>
+      <w:r>
+        <w:rPr>
+          <w:rFonts w:ascii="Calibri" w:eastAsia="Calibri" w:hAnsi="Calibri" w:cs="Calibri"/>
+          <w:sz w:val="22"/>
+          <w:szCs w:val="22"/>
+        </w:rPr>
+        <w:t xml:space="preserve">), </w:t>
+      </w:r>
+      <w:proofErr w:type="spellStart"/>
+      <w:proofErr w:type="gramStart"/>
       <w:r>
         <w:rPr>
           <w:rFonts w:ascii="Calibri" w:eastAsia="Calibri" w:hAnsi="Calibri" w:cs="Calibri"/>
@@ -3464,7 +3667,34 @@
           <w:sz w:val="22"/>
           <w:szCs w:val="22"/>
         </w:rPr>
-        <w:t>() y min().</w:t>
+        <w:t>(</w:t>
+      </w:r>
+      <w:proofErr w:type="gramEnd"/>
+      <w:r>
+        <w:rPr>
+          <w:rFonts w:ascii="Calibri" w:eastAsia="Calibri" w:hAnsi="Calibri" w:cs="Calibri"/>
+          <w:sz w:val="22"/>
+          <w:szCs w:val="22"/>
+        </w:rPr>
+        <w:t xml:space="preserve">) y </w:t>
+      </w:r>
+      <w:proofErr w:type="gramStart"/>
+      <w:r>
+        <w:rPr>
+          <w:rFonts w:ascii="Calibri" w:eastAsia="Calibri" w:hAnsi="Calibri" w:cs="Calibri"/>
+          <w:sz w:val="22"/>
+          <w:szCs w:val="22"/>
+        </w:rPr>
+        <w:t>min(</w:t>
+      </w:r>
+      <w:proofErr w:type="gramEnd"/>
+      <w:r>
+        <w:rPr>
+          <w:rFonts w:ascii="Calibri" w:eastAsia="Calibri" w:hAnsi="Calibri" w:cs="Calibri"/>
+          <w:sz w:val="22"/>
+          <w:szCs w:val="22"/>
+        </w:rPr>
+        <w:t>).</w:t>
       </w:r>
     </w:p>
     <w:p>

</xml_diff>

<commit_message>
sigo mejorando la preparación de los diseños de parcial
</commit_message>
<xml_diff>
--- a/3_paciales/1_parcial/Parcial1_Programacion_Python_v1.docx
+++ b/3_paciales/1_parcial/Parcial1_Programacion_Python_v1.docx
@@ -2138,7 +2138,44 @@
         <w:pStyle w:val="Ttulo1"/>
         <w:spacing w:before="300" w:after="150"/>
       </w:pPr>
-      <w:r>
+    </w:p>
+    <w:p>
+      <w:pPr>
+        <w:pStyle w:val="Ttulo1"/>
+        <w:spacing w:before="300" w:after="150"/>
+      </w:pPr>
+    </w:p>
+    <w:p>
+      <w:pPr>
+        <w:pStyle w:val="Ttulo1"/>
+        <w:spacing w:before="300" w:after="150"/>
+      </w:pPr>
+    </w:p>
+    <w:p>
+      <w:pPr>
+        <w:pStyle w:val="Ttulo1"/>
+        <w:spacing w:before="300" w:after="150"/>
+      </w:pPr>
+    </w:p>
+    <w:p>
+      <w:pPr>
+        <w:pStyle w:val="Ttulo1"/>
+        <w:spacing w:before="300" w:after="150"/>
+      </w:pPr>
+    </w:p>
+    <w:p>
+      <w:pPr>
+        <w:pStyle w:val="Ttulo1"/>
+        <w:spacing w:before="300" w:after="150"/>
+      </w:pPr>
+    </w:p>
+    <w:p>
+      <w:pPr>
+        <w:pStyle w:val="Ttulo1"/>
+        <w:spacing w:before="300" w:after="150"/>
+      </w:pPr>
+      <w:r>
+        <w:lastRenderedPageBreak/>
         <w:t xml:space="preserve">Parte II — Operadores aritméticos y </w:t>
       </w:r>
       <w:proofErr w:type="gramStart"/>
@@ -2330,7 +2367,6 @@
           <w:sz w:val="22"/>
           <w:szCs w:val="22"/>
         </w:rPr>
-        <w:lastRenderedPageBreak/>
         <w:t xml:space="preserve">b) Explique por qué c debe declararse necesariamente como </w:t>
       </w:r>
       <w:proofErr w:type="spellStart"/>
@@ -2469,6 +2505,7 @@
         <w:spacing w:before="300" w:after="150"/>
       </w:pPr>
       <w:r>
+        <w:lastRenderedPageBreak/>
         <w:t xml:space="preserve">Parte III — Operadores relacionales y de </w:t>
       </w:r>
       <w:proofErr w:type="gramStart"/>
@@ -2631,7 +2668,6 @@
           <w:sz w:val="22"/>
           <w:szCs w:val="22"/>
         </w:rPr>
-        <w:lastRenderedPageBreak/>
         <w:t xml:space="preserve">c) Explique, en una frase, por qué se dice que los operadores </w:t>
       </w:r>
       <w:proofErr w:type="spellStart"/>

</xml_diff>